<commit_message>
add: add project (#2)
</commit_message>
<xml_diff>
--- a/HomeWorks/homework2/2401212437_RenKai_PS2.docx
+++ b/HomeWorks/homework2/2401212437_RenKai_PS2.docx
@@ -377,15 +377,7 @@
           <w:color w:val="000000"/>
           <w:lang w:val="en-US"/>
         </w:rPr>
-        <w:t xml:space="preserve"> No. 106 [2018]</w:t>
-      </w:r>
-      <w:r>
-        <w:rPr>
-          <w:rFonts w:ascii="Times New Roman" w:eastAsia="KaiTi" w:hAnsi="Times New Roman" w:cs="Times New Roman"/>
-          <w:color w:val="000000"/>
-          <w:lang w:val="en-US"/>
-        </w:rPr>
-        <w:t>)</w:t>
+        <w:t xml:space="preserve"> No. 106 [2018])</w:t>
       </w:r>
       <w:r>
         <w:rPr>
@@ -620,6 +612,7 @@
       <w:r>
         <w:rPr>
           <w:rFonts w:ascii="Times New Roman" w:eastAsia="KaiTi" w:hAnsi="Times New Roman" w:cs="Times New Roman"/>
+          <w:noProof/>
           <w:color w:val="000000"/>
           <w:sz w:val="26"/>
           <w:szCs w:val="26"/>
@@ -698,7 +691,7 @@
         <w:spacing w:line="288" w:lineRule="auto"/>
         <w:jc w:val="center"/>
         <w:rPr>
-          <w:rFonts w:ascii="Times New Roman" w:eastAsia="KaiTi" w:hAnsi="Times New Roman" w:cs="Times New Roman" w:hint="eastAsia"/>
+          <w:rFonts w:ascii="Times New Roman" w:eastAsia="KaiTi" w:hAnsi="Times New Roman" w:cs="Times New Roman"/>
           <w:color w:val="000000"/>
           <w:sz w:val="21"/>
           <w:szCs w:val="21"/>
@@ -1045,17 +1038,7 @@
           <w:lang w:val="en-US"/>
         </w:rPr>
         <w:lastRenderedPageBreak/>
-        <w:t>Strictly prohibiting the business of funds pooling</w:t>
-      </w:r>
-      <w:r>
-        <w:rPr>
-          <w:rFonts w:ascii="Times New Roman" w:eastAsia="KaiTi" w:hAnsi="Times New Roman" w:cs="Times New Roman"/>
-          <w:b/>
-          <w:bCs/>
-          <w:color w:val="000000"/>
-          <w:lang w:val="en-US"/>
-        </w:rPr>
-        <w:t>.</w:t>
+        <w:t>Strictly prohibiting the business of funds pooling.</w:t>
       </w:r>
       <w:r>
         <w:rPr>
@@ -1354,7 +1337,7 @@
         <w:ind w:firstLineChars="200" w:firstLine="480"/>
         <w:jc w:val="both"/>
         <w:rPr>
-          <w:rFonts w:ascii="Times New Roman" w:eastAsia="KaiTi" w:hAnsi="Times New Roman" w:cs="Times New Roman" w:hint="eastAsia"/>
+          <w:rFonts w:ascii="Times New Roman" w:eastAsia="KaiTi" w:hAnsi="Times New Roman" w:cs="Times New Roman"/>
           <w:color w:val="000000"/>
           <w:lang w:val="en-US"/>
         </w:rPr>
@@ -1843,7 +1826,7 @@
         <w:spacing w:line="288" w:lineRule="auto"/>
         <w:jc w:val="center"/>
         <w:rPr>
-          <w:rFonts w:ascii="Times New Roman" w:eastAsia="KaiTi" w:hAnsi="Times New Roman" w:cs="Times New Roman" w:hint="eastAsia"/>
+          <w:rFonts w:ascii="Times New Roman" w:eastAsia="KaiTi" w:hAnsi="Times New Roman" w:cs="Times New Roman"/>
           <w:color w:val="000000"/>
           <w:sz w:val="21"/>
           <w:szCs w:val="21"/>
@@ -2055,7 +2038,7 @@
         <w:ind w:firstLineChars="200" w:firstLine="480"/>
         <w:jc w:val="both"/>
         <w:rPr>
-          <w:rFonts w:ascii="Times New Roman" w:eastAsia="KaiTi" w:hAnsi="Times New Roman" w:cs="Times New Roman" w:hint="eastAsia"/>
+          <w:rFonts w:ascii="Times New Roman" w:eastAsia="KaiTi" w:hAnsi="Times New Roman" w:cs="Times New Roman"/>
           <w:color w:val="000000"/>
           <w:lang w:val="en-US"/>
         </w:rPr>
@@ -2196,6 +2179,7 @@
       <w:r>
         <w:rPr>
           <w:rFonts w:ascii="Times New Roman" w:eastAsia="KaiTi" w:hAnsi="Times New Roman" w:cs="Times New Roman"/>
+          <w:noProof/>
           <w:color w:val="000000"/>
         </w:rPr>
         <w:drawing>
@@ -2867,7 +2851,23 @@
           <w:color w:val="000000"/>
           <w:lang w:val="en-US"/>
         </w:rPr>
-        <w:t xml:space="preserve"> By the end of June 2021, the allocation ratio of bank wealth management products to non-standard has declined from the previous high of 17% to 13%, and has been replaced by an increased allocation to credit bonds.</w:t>
+        <w:t xml:space="preserve"> By the end of June 2021, the allocation ratio of bank </w:t>
+      </w:r>
+      <w:r>
+        <w:rPr>
+          <w:rFonts w:ascii="Times New Roman" w:hAnsi="Times New Roman" w:cs="Times New Roman"/>
+          <w:color w:val="000000"/>
+          <w:lang w:val="en-US"/>
+        </w:rPr>
+        <w:t>asset</w:t>
+      </w:r>
+      <w:r>
+        <w:rPr>
+          <w:rFonts w:ascii="Times New Roman" w:hAnsi="Times New Roman" w:cs="Times New Roman"/>
+          <w:color w:val="000000"/>
+          <w:lang w:val="en-US"/>
+        </w:rPr>
+        <w:t xml:space="preserve"> management products to non-standard has declined from the previous high of 17% to 13%, and has been replaced by an increased allocation to credit bonds.</w:t>
       </w:r>
       <w:r>
         <w:rPr>
@@ -2883,7 +2883,23 @@
           <w:color w:val="000000"/>
           <w:lang w:val="en-US"/>
         </w:rPr>
-        <w:t>The total size of non-standard assets held by bank wealth management in June 2021 was about 3.75 trillion yuan.</w:t>
+        <w:t xml:space="preserve">The total size of non-standard assets held by bank </w:t>
+      </w:r>
+      <w:r>
+        <w:rPr>
+          <w:rFonts w:ascii="Times New Roman" w:hAnsi="Times New Roman" w:cs="Times New Roman"/>
+          <w:color w:val="000000"/>
+          <w:lang w:val="en-US"/>
+        </w:rPr>
+        <w:t>asset</w:t>
+      </w:r>
+      <w:r>
+        <w:rPr>
+          <w:rFonts w:ascii="Times New Roman" w:hAnsi="Times New Roman" w:cs="Times New Roman"/>
+          <w:color w:val="000000"/>
+          <w:lang w:val="en-US"/>
+        </w:rPr>
+        <w:t xml:space="preserve"> management in June 2021 was about 3.75 trillion yuan.</w:t>
       </w:r>
     </w:p>
     <w:p>
@@ -3062,7 +3078,7 @@
         <w:ind w:firstLineChars="200" w:firstLine="480"/>
         <w:jc w:val="both"/>
         <w:rPr>
-          <w:rFonts w:ascii="Times New Roman" w:hAnsi="Times New Roman" w:cs="Times New Roman" w:hint="eastAsia"/>
+          <w:rFonts w:ascii="Times New Roman" w:hAnsi="Times New Roman" w:cs="Times New Roman"/>
           <w:color w:val="000000"/>
           <w:lang w:val="en-US"/>
         </w:rPr>
@@ -3487,7 +3503,7 @@
           <w:color w:val="000000"/>
           <w:lang w:val="en-US"/>
         </w:rPr>
-        <w:t xml:space="preserve"> management business transformation as well as the development and steady increase in the scale of wealth management companies, the share of </w:t>
+        <w:t xml:space="preserve"> management business transformation as well as the development and steady increase in the scale of </w:t>
       </w:r>
       <w:r>
         <w:rPr>
@@ -3503,7 +3519,39 @@
           <w:color w:val="000000"/>
           <w:lang w:val="en-US"/>
         </w:rPr>
-        <w:t xml:space="preserve"> management companies continues to increase steadily and has become the main force in the wealth management market.</w:t>
+        <w:t xml:space="preserve"> management companies, the share of </w:t>
+      </w:r>
+      <w:r>
+        <w:rPr>
+          <w:rFonts w:ascii="Times New Roman" w:eastAsia="KaiTi" w:hAnsi="Times New Roman" w:cs="Times New Roman"/>
+          <w:color w:val="000000"/>
+          <w:lang w:val="en-US"/>
+        </w:rPr>
+        <w:t>asset</w:t>
+      </w:r>
+      <w:r>
+        <w:rPr>
+          <w:rFonts w:ascii="Times New Roman" w:eastAsia="KaiTi" w:hAnsi="Times New Roman" w:cs="Times New Roman"/>
+          <w:color w:val="000000"/>
+          <w:lang w:val="en-US"/>
+        </w:rPr>
+        <w:t xml:space="preserve"> management companies continues to increase steadily and has become the main force in the </w:t>
+      </w:r>
+      <w:r>
+        <w:rPr>
+          <w:rFonts w:ascii="Times New Roman" w:eastAsia="KaiTi" w:hAnsi="Times New Roman" w:cs="Times New Roman"/>
+          <w:color w:val="000000"/>
+          <w:lang w:val="en-US"/>
+        </w:rPr>
+        <w:t>asset</w:t>
+      </w:r>
+      <w:r>
+        <w:rPr>
+          <w:rFonts w:ascii="Times New Roman" w:eastAsia="KaiTi" w:hAnsi="Times New Roman" w:cs="Times New Roman"/>
+          <w:color w:val="000000"/>
+          <w:lang w:val="en-US"/>
+        </w:rPr>
+        <w:t xml:space="preserve"> management market.</w:t>
       </w:r>
     </w:p>
     <w:p>
@@ -3723,7 +3771,7 @@
         <w:snapToGrid w:val="0"/>
         <w:spacing w:line="288" w:lineRule="auto"/>
         <w:rPr>
-          <w:rFonts w:ascii="Times New Roman" w:eastAsia="KaiTi" w:hAnsi="Times New Roman" w:cs="Times New Roman" w:hint="eastAsia"/>
+          <w:rFonts w:ascii="Times New Roman" w:eastAsia="KaiTi" w:hAnsi="Times New Roman" w:cs="Times New Roman"/>
           <w:b/>
           <w:bCs/>
           <w:color w:val="000000"/>
@@ -3988,7 +4036,7 @@
         <w:snapToGrid w:val="0"/>
         <w:spacing w:line="288" w:lineRule="auto"/>
         <w:rPr>
-          <w:rFonts w:ascii="Times New Roman" w:eastAsia="KaiTi" w:hAnsi="Times New Roman" w:cs="Times New Roman" w:hint="eastAsia"/>
+          <w:rFonts w:ascii="Times New Roman" w:eastAsia="KaiTi" w:hAnsi="Times New Roman" w:cs="Times New Roman"/>
           <w:b/>
           <w:bCs/>
           <w:color w:val="000000"/>
@@ -4311,31 +4359,7 @@
           <w:szCs w:val="26"/>
           <w:lang w:val="en-US"/>
         </w:rPr>
-        <w:t>I</w:t>
-      </w:r>
-      <w:r>
-        <w:rPr>
-          <w:rFonts w:ascii="Times New Roman" w:eastAsia="KaiTi" w:hAnsi="Times New Roman" w:cs="Times New Roman"/>
-          <w:b/>
-          <w:bCs/>
-          <w:color w:val="000000"/>
-          <w:sz w:val="26"/>
-          <w:szCs w:val="26"/>
-          <w:lang w:val="en-US"/>
-        </w:rPr>
-        <w:t>nsurance</w:t>
-      </w:r>
-      <w:r>
-        <w:rPr>
-          <w:rFonts w:ascii="Times New Roman" w:eastAsia="KaiTi" w:hAnsi="Times New Roman" w:cs="Times New Roman"/>
-          <w:b/>
-          <w:bCs/>
-          <w:color w:val="000000"/>
-          <w:sz w:val="26"/>
-          <w:szCs w:val="26"/>
-          <w:lang w:val="en-US"/>
-        </w:rPr>
-        <w:t xml:space="preserve">: </w:t>
+        <w:t xml:space="preserve">Insurance: </w:t>
       </w:r>
       <w:r>
         <w:rPr>
@@ -4374,7 +4398,7 @@
         <w:ind w:firstLineChars="200" w:firstLine="480"/>
         <w:jc w:val="both"/>
         <w:rPr>
-          <w:rFonts w:ascii="Times New Roman" w:eastAsia="KaiTi" w:hAnsi="Times New Roman" w:cs="Times New Roman" w:hint="eastAsia"/>
+          <w:rFonts w:ascii="Times New Roman" w:eastAsia="KaiTi" w:hAnsi="Times New Roman" w:cs="Times New Roman"/>
           <w:color w:val="000000"/>
           <w:lang w:val="en-US"/>
         </w:rPr>
@@ -4780,7 +4804,7 @@
       <w:pPr>
         <w:pStyle w:val="FootnoteText"/>
         <w:rPr>
-          <w:rFonts w:ascii="Times New Roman" w:hAnsi="Times New Roman" w:cs="Times New Roman" w:hint="eastAsia"/>
+          <w:rFonts w:ascii="Times New Roman" w:hAnsi="Times New Roman" w:cs="Times New Roman"/>
           <w:lang w:val="en-US"/>
         </w:rPr>
       </w:pPr>
@@ -4854,34 +4878,14 @@
         <w:rPr>
           <w:rFonts w:ascii="Times New Roman" w:hAnsi="Times New Roman" w:cs="Times New Roman"/>
         </w:rPr>
-        <w:t xml:space="preserve"> </w:t>
-      </w:r>
-      <w:r>
-        <w:rPr>
-          <w:rFonts w:ascii="Times New Roman" w:hAnsi="Times New Roman" w:cs="Times New Roman"/>
-        </w:rPr>
-        <w:t>The</w:t>
-      </w:r>
-      <w:r>
-        <w:rPr>
-          <w:rFonts w:ascii="Times New Roman" w:hAnsi="Times New Roman" w:cs="Times New Roman"/>
-          <w:lang w:val="en-US"/>
-        </w:rPr>
-        <w:t xml:space="preserve"> data is from “</w:t>
-      </w:r>
-      <w:r>
-        <w:rPr>
-          <w:rFonts w:ascii="Times New Roman" w:hAnsi="Times New Roman" w:cs="Times New Roman"/>
-          <w:lang w:val="en-US"/>
-        </w:rPr>
-        <w:t>The impact of China’s new asset management regulations</w:t>
-      </w:r>
-      <w:r>
-        <w:rPr>
-          <w:rFonts w:ascii="Times New Roman" w:hAnsi="Times New Roman" w:cs="Times New Roman"/>
-          <w:lang w:val="en-US"/>
-        </w:rPr>
-        <w:t>”</w:t>
+        <w:t xml:space="preserve"> The</w:t>
+      </w:r>
+      <w:r>
+        <w:rPr>
+          <w:rFonts w:ascii="Times New Roman" w:hAnsi="Times New Roman" w:cs="Times New Roman"/>
+          <w:lang w:val="en-US"/>
+        </w:rPr>
+        <w:t xml:space="preserve"> data is from “The impact of China’s new asset management regulations”</w:t>
       </w:r>
     </w:p>
   </w:footnote>
@@ -6778,6 +6782,7 @@
   <w:style w:type="character" w:default="1" w:styleId="DefaultParagraphFont">
     <w:name w:val="Default Paragraph Font"/>
     <w:uiPriority w:val="1"/>
+    <w:semiHidden/>
     <w:unhideWhenUsed/>
   </w:style>
   <w:style w:type="table" w:default="1" w:styleId="TableNormal">

</xml_diff>